<commit_message>
feat: enhance repository credentials endpoint and update API documentation
</commit_message>
<xml_diff>
--- a/portal_apis_documentation.docx
+++ b/portal_apis_documentation.docx
@@ -1021,6 +1021,324 @@
           <w:color w:val="718096"/>
           <w:sz w:val="22"/>
         </w:rPr>
+        <w:t xml:space="preserve">[Repositories] </w:t>
+      </w:r>
+      <w:r>
+        <w:rPr>
+          <w:color w:val="2B6CB0"/>
+        </w:rPr>
+        <w:t xml:space="preserve">GET </w:t>
+      </w:r>
+      <w:r>
+        <w:rPr>
+          <w:color w:val="1A202C"/>
+        </w:rPr>
+        <w:t>/api/repositories/credentials</w:t>
+      </w:r>
+    </w:p>
+    <w:p>
+      <w:r>
+        <w:rPr>
+          <w:b/>
+        </w:rPr>
+        <w:t>Summary: Fetch Decrypted GitHub Credentials for n8n Workflows</w:t>
+      </w:r>
+      <w:r>
+        <w:br/>
+        <w:t>Internal automated endpoint used by the n8n CodeGuards PR Reviewer pipeline. Authenticates via X-Internal-Token header, decrypts the stored PAT, and returns the username and token so all GitHub API calls (PR metadata, diff, rules, file reading, and review posting) execute with the repository owner's GitHub credentials.</w:t>
+      </w:r>
+    </w:p>
+    <w:tbl>
+      <w:tblPr>
+        <w:tblW w:type="auto" w:w="0"/>
+        <w:jc w:val="center"/>
+        <w:tblLayout w:type="fixed"/>
+        <w:tblLook w:firstColumn="1" w:firstRow="1" w:lastColumn="0" w:lastRow="0" w:noHBand="0" w:noVBand="1" w:val="04A0"/>
+      </w:tblPr>
+      <w:tblGrid>
+        <w:gridCol w:w="4968"/>
+        <w:gridCol w:w="4968"/>
+      </w:tblGrid>
+      <w:tr>
+        <w:tc>
+          <w:tcPr>
+            <w:tcW w:type="dxa" w:w="2592"/>
+            <w:shd w:fill="EDF2F7"/>
+            <w:tcMar>
+              <w:top w:w="40" w:type="dxa"/>
+              <w:bottom w:w="40" w:type="dxa"/>
+              <w:left w:w="80" w:type="dxa"/>
+              <w:right w:w="80" w:type="dxa"/>
+            </w:tcMar>
+          </w:tcPr>
+          <w:p>
+            <w:r>
+              <w:rPr>
+                <w:b/>
+                <w:sz w:val="18"/>
+              </w:rPr>
+              <w:t>Query Parameters</w:t>
+            </w:r>
+          </w:p>
+        </w:tc>
+        <w:tc>
+          <w:tcPr>
+            <w:tcW w:type="dxa" w:w="7200"/>
+            <w:shd w:fill="FFFFFF"/>
+            <w:tcMar>
+              <w:top w:w="40" w:type="dxa"/>
+              <w:bottom w:w="40" w:type="dxa"/>
+              <w:left w:w="80" w:type="dxa"/>
+              <w:right w:w="80" w:type="dxa"/>
+            </w:tcMar>
+          </w:tcPr>
+          <w:p>
+            <w:r>
+              <w:rPr>
+                <w:sz w:val="18"/>
+              </w:rPr>
+              <w:t>full_name (Query String, Required, string, e.g. 'owner/repo')</w:t>
+            </w:r>
+          </w:p>
+        </w:tc>
+      </w:tr>
+      <w:tr>
+        <w:tc>
+          <w:tcPr>
+            <w:tcW w:type="dxa" w:w="2592"/>
+            <w:shd w:fill="EDF2F7"/>
+            <w:tcMar>
+              <w:top w:w="40" w:type="dxa"/>
+              <w:bottom w:w="40" w:type="dxa"/>
+              <w:left w:w="80" w:type="dxa"/>
+              <w:right w:w="80" w:type="dxa"/>
+            </w:tcMar>
+          </w:tcPr>
+          <w:p>
+            <w:r>
+              <w:rPr>
+                <w:b/>
+                <w:sz w:val="18"/>
+              </w:rPr>
+              <w:t>Response: 200 OK</w:t>
+            </w:r>
+          </w:p>
+        </w:tc>
+        <w:tc>
+          <w:tcPr>
+            <w:tcW w:type="dxa" w:w="7200"/>
+            <w:shd w:fill="F7FAFC"/>
+            <w:tcMar>
+              <w:top w:w="40" w:type="dxa"/>
+              <w:bottom w:w="40" w:type="dxa"/>
+              <w:left w:w="80" w:type="dxa"/>
+              <w:right w:w="80" w:type="dxa"/>
+            </w:tcMar>
+          </w:tcPr>
+          <w:p>
+            <w:r>
+              <w:rPr>
+                <w:rFonts w:ascii="Consolas" w:hAnsi="Consolas"/>
+                <w:sz w:val="18"/>
+              </w:rPr>
+              <w:t>{</w:t>
+              <w:br/>
+              <w:t xml:space="preserve">  "github_username": "octocat",</w:t>
+              <w:br/>
+              <w:t xml:space="preserve">  "github_pat": "ghp_PersonalAccessTokenOrAppPassword"</w:t>
+              <w:br/>
+              <w:t>}</w:t>
+            </w:r>
+          </w:p>
+        </w:tc>
+      </w:tr>
+      <w:tr>
+        <w:tc>
+          <w:tcPr>
+            <w:tcW w:type="dxa" w:w="2592"/>
+            <w:shd w:fill="EDF2F7"/>
+            <w:tcMar>
+              <w:top w:w="40" w:type="dxa"/>
+              <w:bottom w:w="40" w:type="dxa"/>
+              <w:left w:w="80" w:type="dxa"/>
+              <w:right w:w="80" w:type="dxa"/>
+            </w:tcMar>
+          </w:tcPr>
+          <w:p>
+            <w:r>
+              <w:rPr>
+                <w:b/>
+                <w:sz w:val="18"/>
+              </w:rPr>
+              <w:t>Response: 401 Unauthorized</w:t>
+            </w:r>
+          </w:p>
+        </w:tc>
+        <w:tc>
+          <w:tcPr>
+            <w:tcW w:type="dxa" w:w="7200"/>
+            <w:shd w:fill="F7FAFC"/>
+            <w:tcMar>
+              <w:top w:w="40" w:type="dxa"/>
+              <w:bottom w:w="40" w:type="dxa"/>
+              <w:left w:w="80" w:type="dxa"/>
+              <w:right w:w="80" w:type="dxa"/>
+            </w:tcMar>
+          </w:tcPr>
+          <w:p>
+            <w:r>
+              <w:rPr>
+                <w:rFonts w:ascii="Consolas" w:hAnsi="Consolas"/>
+                <w:sz w:val="18"/>
+              </w:rPr>
+              <w:t>{"detail": "Missing or invalid X-Internal-Token header."}</w:t>
+            </w:r>
+          </w:p>
+        </w:tc>
+      </w:tr>
+      <w:tr>
+        <w:tc>
+          <w:tcPr>
+            <w:tcW w:type="dxa" w:w="2592"/>
+            <w:shd w:fill="EDF2F7"/>
+            <w:tcMar>
+              <w:top w:w="40" w:type="dxa"/>
+              <w:bottom w:w="40" w:type="dxa"/>
+              <w:left w:w="80" w:type="dxa"/>
+              <w:right w:w="80" w:type="dxa"/>
+            </w:tcMar>
+          </w:tcPr>
+          <w:p>
+            <w:r>
+              <w:rPr>
+                <w:b/>
+                <w:sz w:val="18"/>
+              </w:rPr>
+              <w:t>Response: 404 Not Found</w:t>
+            </w:r>
+          </w:p>
+        </w:tc>
+        <w:tc>
+          <w:tcPr>
+            <w:tcW w:type="dxa" w:w="7200"/>
+            <w:shd w:fill="F7FAFC"/>
+            <w:tcMar>
+              <w:top w:w="40" w:type="dxa"/>
+              <w:bottom w:w="40" w:type="dxa"/>
+              <w:left w:w="80" w:type="dxa"/>
+              <w:right w:w="80" w:type="dxa"/>
+            </w:tcMar>
+          </w:tcPr>
+          <w:p>
+            <w:r>
+              <w:rPr>
+                <w:rFonts w:ascii="Consolas" w:hAnsi="Consolas"/>
+                <w:sz w:val="18"/>
+              </w:rPr>
+              <w:t>{"detail": "Repository 'owner/repo' not found."}</w:t>
+            </w:r>
+          </w:p>
+        </w:tc>
+      </w:tr>
+      <w:tr>
+        <w:tc>
+          <w:tcPr>
+            <w:tcW w:type="dxa" w:w="2592"/>
+            <w:shd w:fill="EDF2F7"/>
+            <w:tcMar>
+              <w:top w:w="40" w:type="dxa"/>
+              <w:bottom w:w="40" w:type="dxa"/>
+              <w:left w:w="80" w:type="dxa"/>
+              <w:right w:w="80" w:type="dxa"/>
+            </w:tcMar>
+          </w:tcPr>
+          <w:p>
+            <w:r>
+              <w:rPr>
+                <w:b/>
+                <w:sz w:val="18"/>
+              </w:rPr>
+              <w:t>Response: 400 Bad Request</w:t>
+            </w:r>
+          </w:p>
+        </w:tc>
+        <w:tc>
+          <w:tcPr>
+            <w:tcW w:type="dxa" w:w="7200"/>
+            <w:shd w:fill="F7FAFC"/>
+            <w:tcMar>
+              <w:top w:w="40" w:type="dxa"/>
+              <w:bottom w:w="40" w:type="dxa"/>
+              <w:left w:w="80" w:type="dxa"/>
+              <w:right w:w="80" w:type="dxa"/>
+            </w:tcMar>
+          </w:tcPr>
+          <w:p>
+            <w:r>
+              <w:rPr>
+                <w:rFonts w:ascii="Consolas" w:hAnsi="Consolas"/>
+                <w:sz w:val="18"/>
+              </w:rPr>
+              <w:t>{"detail": "Repository token is not available. Please re-register the repository."}</w:t>
+            </w:r>
+          </w:p>
+        </w:tc>
+      </w:tr>
+      <w:tr>
+        <w:tc>
+          <w:tcPr>
+            <w:tcW w:type="dxa" w:w="2592"/>
+            <w:shd w:fill="EDF2F7"/>
+            <w:tcMar>
+              <w:top w:w="40" w:type="dxa"/>
+              <w:bottom w:w="40" w:type="dxa"/>
+              <w:left w:w="80" w:type="dxa"/>
+              <w:right w:w="80" w:type="dxa"/>
+            </w:tcMar>
+          </w:tcPr>
+          <w:p>
+            <w:r>
+              <w:rPr>
+                <w:b/>
+                <w:sz w:val="18"/>
+              </w:rPr>
+              <w:t>Response: 503 Service Unavailable</w:t>
+            </w:r>
+          </w:p>
+        </w:tc>
+        <w:tc>
+          <w:tcPr>
+            <w:tcW w:type="dxa" w:w="7200"/>
+            <w:shd w:fill="F7FAFC"/>
+            <w:tcMar>
+              <w:top w:w="40" w:type="dxa"/>
+              <w:bottom w:w="40" w:type="dxa"/>
+              <w:left w:w="80" w:type="dxa"/>
+              <w:right w:w="80" w:type="dxa"/>
+            </w:tcMar>
+          </w:tcPr>
+          <w:p>
+            <w:r>
+              <w:rPr>
+                <w:rFonts w:ascii="Consolas" w:hAnsi="Consolas"/>
+                <w:sz w:val="18"/>
+              </w:rPr>
+              <w:t>{"detail": "N8N_INTERNAL_TOKEN is not configured."}</w:t>
+            </w:r>
+          </w:p>
+        </w:tc>
+      </w:tr>
+    </w:tbl>
+    <w:p/>
+    <w:p>
+      <w:pPr>
+        <w:pStyle w:val="Heading2"/>
+      </w:pPr>
+      <w:r>
+        <w:rPr>
+          <w:color w:val="718096"/>
+          <w:sz w:val="22"/>
+        </w:rPr>
         <w:t xml:space="preserve">[KT Chatbot] </w:t>
       </w:r>
       <w:r>

</xml_diff>